<commit_message>
Synthesis v2.1: replace report + inventory in place; add Caffrey2 round-2 memo
</commit_message>
<xml_diff>
--- a/Synthesis/gsib-board_duties-combined_report.docx
+++ b/Synthesis/gsib-board_duties-combined_report.docx
@@ -67,7 +67,7 @@
           <w:sz w:val="20"/>
           <w:szCs w:val="20"/>
         </w:rPr>
-        <w:t xml:space="preserve">Version 2.0 — with legal-force and supervisory-consequence dimensions, duplicate clusters, a burden model, a reform roadmap, and a verification table</w:t>
+        <w:t>Version 2.1 — adds a credit-risk domain, fiduciary (trust) governance, director-eligibility and attestation duties, a cordoned personal-liability section, and precision corrections, integrating the Caffrey2 supervisory-expectations memo; retains the legal-force and supervisory-consequence dimensions, duplicate clusters, burden model, reform roadmap, and verification table</w:t>
       </w:r>
     </w:p>
     <w:p>
@@ -83,7 +83,7 @@
           <w:sz w:val="22"/>
           <w:szCs w:val="22"/>
         </w:rPr>
-        <w:t xml:space="preserve">As of June 5, 2026</w:t>
+        <w:t>As of June 24, 2026 (v2.1)</w:t>
       </w:r>
     </w:p>
     <w:p>
@@ -179,7 +179,7 @@
           <w:sz w:val="22"/>
           <w:szCs w:val="22"/>
         </w:rPr>
-        <w:t xml:space="preserve">On the count. The headline number depends entirely on the unit of analysis, so this edition reports three figures rather than one: a narrow count of 55 in-force binding obligations; a medium count of 83 (binding obligations plus rule-backed expectations); and a broad count of 197 current board duties across both layers. The duties collapse into roughly 23 functional clusters — the unit most relevant to reform. None of these is an exact statutory tally; counting granularity (the risk committee is one duty or seven sub-duties) drives the spread.</w:t>
+        <w:t>On the count. The headline number depends entirely on the unit of analysis, so this edition reports three figures rather than one: a narrow count of 68 in-force binding obligations; a medium count of 98 (binding obligations plus rule-backed expectations); and a broad count of 214 current board duties across both layers. The duties collapse into roughly 26 functional clusters — the unit most relevant to reform. (v2.1 re-tally: the v2.0 figures were 55 / 83 / 197 / 23; the increase reflects the credit-risk, fiduciary, and director-eligibility additions. The four personal-liability items are individual-director exposures, excluded from these board-duty totals.) None of these is an exact statutory tally; counting granularity (the risk committee is one duty or seven sub-duties) drives the spread.</w:t>
       </w:r>
     </w:p>
     <w:p>
@@ -279,6 +279,11 @@
           <w:szCs w:val="22"/>
         </w:rPr>
         <w:t xml:space="preserve">Method. Synthesized from multiple independent analyses per layer (for obligations: a citation-level inventory, a quantified inventory, a reform analysis, and a legal memo; for expectations: a source-verified inventory and a legal-conflict memo), then enriched with the legal-force, consequence, entity, cadence, cluster, redundancy, confidence, and source-URL fields described above.</w:t>
+      </w:r>
+    </w:p>
+    <w:p>
+      <w:r>
+        <w:t>Changelog (v2.1, June 24, 2026). This edition integrates a fourth independent obligations inventory — the Caffrey2 supervisory-expectations memo. It adds a credit-risk domain, fiduciary (trust) governance, and director-eligibility/attestation/continuity duties to the binding inventory; adds credit-risk and additional consumer-compliance expectations; adds a cordoned personal- and individual-director-liability section (not counted as recurring board actions); sharpens the model-risk (express non-enforceability of SR 26-2 / OCC Bulletin 2026-13), resolution-cadence (biennial), BSA (two unreconciled rewrites), cyber-timeline, and OCC Appendix D reliance-accommodation entries; reconciles the duty counts against an independent annual-board-action count; and reorganizes the reform roadmap into instrument-based feasibility tiers. Newly added entries are Caffrey2-sourced and flagged for primary-source verification.</w:t>
       </w:r>
     </w:p>
     <w:p>
@@ -545,7 +550,7 @@
                 <w:sz w:val="14"/>
                 <w:szCs w:val="14"/>
               </w:rPr>
-              <w:t xml:space="preserve">55</w:t>
+              <w:t>68</w:t>
             </w:r>
           </w:p>
         </w:tc>
@@ -643,7 +648,7 @@
                 <w:sz w:val="14"/>
                 <w:szCs w:val="14"/>
               </w:rPr>
-              <w:t xml:space="preserve">83</w:t>
+              <w:t>98</w:t>
             </w:r>
           </w:p>
         </w:tc>
@@ -741,7 +746,7 @@
                 <w:sz w:val="14"/>
                 <w:szCs w:val="14"/>
               </w:rPr>
-              <w:t xml:space="preserve">197</w:t>
+              <w:t>214</w:t>
             </w:r>
           </w:p>
         </w:tc>
@@ -839,7 +844,7 @@
                 <w:sz w:val="14"/>
                 <w:szCs w:val="14"/>
               </w:rPr>
-              <w:t xml:space="preserve">23</w:t>
+              <w:t>26</w:t>
             </w:r>
           </w:p>
         </w:tc>
@@ -862,6 +867,11 @@
       </w:r>
     </w:p>
     <w:p>
+      <w:r>
+        <w:t>Cross-check against an independent inventory (v2.1). A separately constructed citation-level memo (the Caffrey2 supervisory-expectations memo) counts discrete, separately-documented board or committee actions required at least annually by a binding instrument — excluding proposed, withdrawn, and rescinded items and non-enforceable sound-practice guidance, and not double-counting a single vehicle that binds both the holding-company and IDI boards. On that unit it reaches roughly 70—75 discrete actions across both board tiers (about 20—25 incremental at the IDI tier) and reflects the biennial — not annual — resolution-plan approval cadence (12 CFR 243.4(a)). That action-count basis sits between this report’s medium (98) and broad (214) duty counts and is consistent with them: it counts annual board actions, whereas the figures above count duties. The convergence of two independently-derived inventories increases confidence in the order of magnitude rather than any single headline number.</w:t>
+      </w:r>
+    </w:p>
+    <w:p>
       <w:pPr>
         <w:pStyle w:val="Heading1"/>
         <w:spacing w:after="160"/>
@@ -883,7 +893,7 @@
           <w:sz w:val="22"/>
           <w:szCs w:val="22"/>
         </w:rPr>
-        <w:t xml:space="preserve">The 57 board obligations imposed by federal statute, regulation, and enforceable agency guideline, organized by domain. Regulation YY is the single largest source, followed by the OCC Heightened Standards and the SEC/SOX/listing requirements.</w:t>
+        <w:t>The 70 board obligations imposed by federal statute, regulation, and enforceable agency guideline, organized by domain (v2.0: 57; v2.1 adds the credit-risk, fiduciary (trust), and director-eligibility/attestation domains below). Regulation YY is the single largest source, followed by the OCC Heightened Standards and the SEC/SOX/listing requirements. The Executive-summary headline counts have been re-tallied in v2.1 to include these additions.</w:t>
       </w:r>
     </w:p>
     <w:tbl>
@@ -7757,7 +7767,7 @@
           <w:sz w:val="17"/>
           <w:szCs w:val="17"/>
         </w:rPr>
-        <w:t xml:space="preserve">Overlap: Parallel to the FDIC IDI resolution plan (RES-02): two minuted approvals, two cadences, two rules, overlapping content.  Reform: Permit a single board approval covering both the Title I and IDI submissions, with an IDI annex.</w:t>
+        <w:t>Overlap: Parallel to the FDIC IDI resolution plan (RES-02): two minuted approvals, two cadences, two rules, overlapping content.  Reform: Permit a single board approval covering both the Title I and IDI submissions, with an IDI annex.  Cadence note (v2.1): board approval is required on the biennial Title I filing cycle (12 CFR 243.4(a)), not annually; the burden model annualizes this cluster accordingly.</w:t>
       </w:r>
     </w:p>
     <w:p>
@@ -11876,6 +11886,487 @@
     <w:p>
       <w:r>
         <w:br w:type="page"/>
+      </w:r>
+    </w:p>
+    <w:p>
+      <w:pPr>
+        <w:pStyle w:val="Heading2"/>
+      </w:pPr>
+      <w:r>
+        <w:t>14. Credit risk governance</w:t>
+      </w:r>
+    </w:p>
+    <w:p>
+      <w:r>
+        <w:t>Board-level credit-risk duties drawn from the interagency real-estate-lending standards, the allowance-for-credit-losses framework, Regulation O, Regulation W, and Regulation F. Added in v2.1 to close a domain gap identified against the Caffrey2 memo; citations are Caffrey2-sourced and should be confirmed against primary sources before reliance.</w:t>
+      </w:r>
+    </w:p>
+    <w:p>
+      <w:r>
+        <w:rPr>
+          <w:b/>
+        </w:rPr>
+        <w:t>CRD-01  —  Full board  ·  IDI</w:t>
+      </w:r>
+    </w:p>
+    <w:p>
+      <w:r>
+        <w:t>Board must adopt and review at least annually a written real-estate-lending policy consistent with safe-and-sound standards and the interagency Real Estate Lending Standards.</w:t>
+      </w:r>
+    </w:p>
+    <w:p>
+      <w:r>
+        <w:t>Source: Real Estate Lending Standards — 12 CFR part 208 subpart E (FRB) / 12 CFR part 365 (FDIC) / 12 CFR part 34 subpart D (OCC); FDI Act §304. [URL not captured]</w:t>
+      </w:r>
+    </w:p>
+    <w:p>
+      <w:r>
+        <w:rPr>
+          <w:i/>
+        </w:rPr>
+        <w:t>Legal force: Regulation  ·  Consequence: Enforcement (cease-and-desist, CMP); rating downgrade  ·  Cadence: Annual  ·  Cluster: Credit risk governance  ·  Redundancy: Candidate redundancy (parallel agency appendices)  ·  Confidence: Medium (Caffrey2-sourced; verify against primary source)</w:t>
+      </w:r>
+    </w:p>
+    <w:p>
+      <w:r>
+        <w:rPr>
+          <w:i/>
+        </w:rPr>
+        <w:t>Overlap: The same annual policy-approval duty is codified in parallel by the OCC, FDIC, and FRB.  Reform: One interagency real-estate-lending standard; a single board approval satisfies all three.</w:t>
+      </w:r>
+    </w:p>
+    <w:p>
+      <w:r>
+        <w:rPr>
+          <w:b/>
+        </w:rPr>
+        <w:t>CRD-02  —  Full board or designated committee  ·  BHC &amp; IDI</w:t>
+      </w:r>
+    </w:p>
+    <w:p>
+      <w:r>
+        <w:t>Board oversight of the allowance for credit losses (ACL/CECL) framework and methodology, ensuring an appropriate, well-documented allowance.</w:t>
+      </w:r>
+    </w:p>
+    <w:p>
+      <w:r>
+        <w:t>Source: Interagency Policy Statement on Allowances for Credit Losses; FDI Act §39 safety-and-soundness; ASC 326 (CECL). [URL not captured]</w:t>
+      </w:r>
+    </w:p>
+    <w:p>
+      <w:r>
+        <w:rPr>
+          <w:i/>
+        </w:rPr>
+        <w:t>Legal force: Regulation / guidance  ·  Consequence: Enforcement; informs ratings  ·  Cadence: Quarterly / periodic  ·  Cluster: Credit risk governance  ·  Redundancy: Candidate redundancy  ·  Confidence: Medium (Caffrey2-sourced; verify against primary source)</w:t>
+      </w:r>
+    </w:p>
+    <w:p>
+      <w:r>
+        <w:rPr>
+          <w:i/>
+        </w:rPr>
+        <w:t>Overlap: ACL governance overlaps audit-committee financial-reporting oversight and OCC/FRB credit-review expectations.  Reform: Fold ACL oversight into the audit/risk-committee credit cycle.</w:t>
+      </w:r>
+    </w:p>
+    <w:p>
+      <w:r>
+        <w:rPr>
+          <w:b/>
+        </w:rPr>
+        <w:t>CRD-03  —  Full board or risk committee  ·  BHC &amp; IDI</w:t>
+      </w:r>
+    </w:p>
+    <w:p>
+      <w:r>
+        <w:t>Board ensures an independent credit-risk-review (loan review) function whose findings are reported to the board or a committee.</w:t>
+      </w:r>
+    </w:p>
+    <w:p>
+      <w:r>
+        <w:t>Source: Interagency Guidance on Credit Risk Review Systems (2020); OCC Heightened Standards 12 CFR part 30 App. D (independent risk management). [URL not captured]</w:t>
+      </w:r>
+    </w:p>
+    <w:p>
+      <w:r>
+        <w:rPr>
+          <w:i/>
+        </w:rPr>
+        <w:t>Legal force: Regulation / guidance  ·  Consequence: Enforcement; informs ratings  ·  Cadence: Periodic  ·  Cluster: Credit risk governance  ·  Redundancy: Candidate redundancy  ·  Confidence: Medium (Caffrey2-sourced; verify against primary source)</w:t>
+      </w:r>
+    </w:p>
+    <w:p>
+      <w:r>
+        <w:rPr>
+          <w:i/>
+        </w:rPr>
+        <w:t>Overlap: Overlaps OCC App. D independent-risk-management and audit oversight.  Reform: Cover within risk-committee credit reporting.</w:t>
+      </w:r>
+    </w:p>
+    <w:p>
+      <w:r>
+        <w:rPr>
+          <w:b/>
+        </w:rPr>
+        <w:t>CRD-04  —  Majority of the entire board  ·  IDI</w:t>
+      </w:r>
+    </w:p>
+    <w:p>
+      <w:r>
+        <w:t>Prior board approval (majority of the entire board, interested party abstaining) of extensions of credit to executive officers, directors, principal shareholders, and their related interests above regulatory thresholds.</w:t>
+      </w:r>
+    </w:p>
+    <w:p>
+      <w:r>
+        <w:t>Source: Federal Reserve Act §22(h); Regulation O, 12 CFR part 215; 12 U.S.C. 375b(3). [URL not captured]</w:t>
+      </w:r>
+    </w:p>
+    <w:p>
+      <w:r>
+        <w:rPr>
+          <w:i/>
+        </w:rPr>
+        <w:t>Legal force: Statute / Regulation  ·  Consequence: Enforcement (cease-and-desist, CMP)  ·  Cadence: Event-driven  ·  Cluster: Insider / affiliate / related-party  ·  Redundancy: Limited overlap (distinct insured-bank protection)  ·  Confidence: Medium (Caffrey2-sourced; verify against primary source)</w:t>
+      </w:r>
+    </w:p>
+    <w:p>
+      <w:r>
+        <w:rPr>
+          <w:i/>
+        </w:rPr>
+        <w:t>Overlap: A specific board-approval trigger within the Reg O regime catalogued at a higher level in domain 11.  Reform: Retain; protects the insured bank.</w:t>
+      </w:r>
+    </w:p>
+    <w:p>
+      <w:r>
+        <w:rPr>
+          <w:b/>
+        </w:rPr>
+        <w:t>CRD-05  —  Majority of the board  ·  IDI</w:t>
+      </w:r>
+    </w:p>
+    <w:p>
+      <w:r>
+        <w:t>Discrete affiliate-transaction board approvals under Regulation W: affiliate-underwritten securities purchases (§223.53(b)), affiliate loan-participation renewals (§223.15(b)(2)), and internal-reorganization asset purchases exempted from §23A (§223.41(d)).</w:t>
+      </w:r>
+    </w:p>
+    <w:p>
+      <w:r>
+        <w:t>Source: Regulation W, 12 CFR part 223; 12 U.S.C. 371c-1. [URL not captured]</w:t>
+      </w:r>
+    </w:p>
+    <w:p>
+      <w:r>
+        <w:rPr>
+          <w:i/>
+        </w:rPr>
+        <w:t>Legal force: Regulation  ·  Consequence: Enforcement (cease-and-desist, CMP)  ·  Cadence: Event-driven  ·  Cluster: Insider / affiliate / related-party  ·  Redundancy: Limited overlap (parallel-but-justified)  ·  Confidence: Medium (Caffrey2-sourced; verify against primary source)</w:t>
+      </w:r>
+    </w:p>
+    <w:p>
+      <w:r>
+        <w:rPr>
+          <w:i/>
+        </w:rPr>
+        <w:t>Overlap: Granular board-approval triggers within the Reg W framework.  Reform: Where permitted, approve standards subject to periodic review rather than transaction-by-transaction.</w:t>
+      </w:r>
+    </w:p>
+    <w:p>
+      <w:r>
+        <w:rPr>
+          <w:b/>
+        </w:rPr>
+        <w:t>CRD-06  —  Full board or designated committee  ·  IDI</w:t>
+      </w:r>
+    </w:p>
+    <w:p>
+      <w:r>
+        <w:t>Board oversight of correspondent credit-concentration policies limiting exposure to individual correspondent banks.</w:t>
+      </w:r>
+    </w:p>
+    <w:p>
+      <w:r>
+        <w:t>Source: Regulation F, 12 CFR part 206. [URL not captured]</w:t>
+      </w:r>
+    </w:p>
+    <w:p>
+      <w:r>
+        <w:rPr>
+          <w:i/>
+        </w:rPr>
+        <w:t>Legal force: Regulation  ·  Consequence: Enforcement; informs ratings  ·  Cadence: Periodic  ·  Cluster: Credit risk governance  ·  Redundancy: Unique / limited overlap  ·  Confidence: Medium (Caffrey2-sourced; verify against primary source)</w:t>
+      </w:r>
+    </w:p>
+    <w:p>
+      <w:r>
+        <w:rPr>
+          <w:i/>
+        </w:rPr>
+        <w:t>Overlap: Folds into enterprise credit-concentration and counterparty-limit monitoring.  Reform: Cover within risk-committee limit monitoring.</w:t>
+      </w:r>
+    </w:p>
+    <w:p>
+      <w:pPr>
+        <w:pStyle w:val="Heading2"/>
+      </w:pPr>
+      <w:r>
+        <w:t>15. Fiduciary (trust) governance</w:t>
+      </w:r>
+    </w:p>
+    <w:p>
+      <w:r>
+        <w:t>Board duties attaching to national-bank fiduciary powers — most material for the custody/trust GSIBs (BNY, State Street). Omitted from v2.0; added in v2.1. Caffrey2-sourced; verify.</w:t>
+      </w:r>
+    </w:p>
+    <w:p>
+      <w:r>
+        <w:rPr>
+          <w:b/>
+        </w:rPr>
+        <w:t>FID-01  —  Full board  ·  IDI</w:t>
+      </w:r>
+    </w:p>
+    <w:p>
+      <w:r>
+        <w:t>The bank’s fiduciary activities must be managed by or under the direction of its board, and the board must adopt written policies governing fiduciary activities.</w:t>
+      </w:r>
+    </w:p>
+    <w:p>
+      <w:r>
+        <w:t>Source: 12 CFR 9.4(a); 12 CFR 9.5 (national banks); 12 CFR part 150 (FSAs). [URL not captured]</w:t>
+      </w:r>
+    </w:p>
+    <w:p>
+      <w:r>
+        <w:rPr>
+          <w:i/>
+        </w:rPr>
+        <w:t>Legal force: Regulation  ·  Consequence: Enforcement; informs ratings  ·  Cadence: Periodic / annual  ·  Cluster: Fiduciary (trust) governance  ·  Redundancy: Unique / limited overlap  ·  Confidence: Medium (Caffrey2-sourced; verify against primary source)</w:t>
+      </w:r>
+    </w:p>
+    <w:p>
+      <w:r>
+        <w:rPr>
+          <w:i/>
+        </w:rPr>
+        <w:t>Overlap: Distinct from enterprise risk governance; trust-charter-specific.  Reform: Retain; distinct statutory purpose.</w:t>
+      </w:r>
+    </w:p>
+    <w:p>
+      <w:r>
+        <w:rPr>
+          <w:b/>
+        </w:rPr>
+        <w:t>FID-02  —  Fiduciary audit committee  ·  IDI</w:t>
+      </w:r>
+    </w:p>
+    <w:p>
+      <w:r>
+        <w:t>A fiduciary audit committee of directors (excluding officers significantly involved in fiduciary administration) must arrange suitable audits of fiduciary activities at least annually.</w:t>
+      </w:r>
+    </w:p>
+    <w:p>
+      <w:r>
+        <w:t>Source: 12 CFR 9.9. [URL not captured]</w:t>
+      </w:r>
+    </w:p>
+    <w:p>
+      <w:r>
+        <w:rPr>
+          <w:i/>
+        </w:rPr>
+        <w:t>Legal force: Regulation  ·  Consequence: Enforcement; informs ratings  ·  Cadence: Annual  ·  Cluster: Audit committee &amp; independence  ·  Redundancy: Candidate redundancy  ·  Confidence: Medium (Caffrey2-sourced; verify against primary source)</w:t>
+      </w:r>
+    </w:p>
+    <w:p>
+      <w:r>
+        <w:rPr>
+          <w:i/>
+        </w:rPr>
+        <w:t>Overlap: Parallels the §36 / Part 363 audit committee but covers fiduciary activities specifically.  Reform: Permit the §36 audit committee to satisfy the fiduciary-audit duty where composition overlaps.</w:t>
+      </w:r>
+    </w:p>
+    <w:p>
+      <w:r>
+        <w:rPr>
+          <w:b/>
+        </w:rPr>
+        <w:t>FID-03  —  Full board  ·  IDI</w:t>
+      </w:r>
+    </w:p>
+    <w:p>
+      <w:r>
+        <w:t>Collective investment funds must operate under a board-approved written plan; fiduciary assets must be held in the joint custody of at least two designated officers.</w:t>
+      </w:r>
+    </w:p>
+    <w:p>
+      <w:r>
+        <w:t>Source: 12 CFR 9.18(b)(1); 12 CFR 9.13(a). [URL not captured]</w:t>
+      </w:r>
+    </w:p>
+    <w:p>
+      <w:r>
+        <w:rPr>
+          <w:i/>
+        </w:rPr>
+        <w:t>Legal force: Regulation  ·  Consequence: Enforcement  ·  Cadence: Periodic  ·  Cluster: Fiduciary (trust) governance  ·  Redundancy: Unique / limited overlap  ·  Confidence: Medium (Caffrey2-sourced; verify against primary source)</w:t>
+      </w:r>
+    </w:p>
+    <w:p>
+      <w:r>
+        <w:rPr>
+          <w:i/>
+        </w:rPr>
+        <w:t>Overlap: Operational fiduciary control; minimal cross-regulator overlap.  Reform: Retain.</w:t>
+      </w:r>
+    </w:p>
+    <w:p>
+      <w:pPr>
+        <w:pStyle w:val="Heading2"/>
+      </w:pPr>
+      <w:r>
+        <w:t>16. Director eligibility, attestation &amp; continuity</w:t>
+      </w:r>
+    </w:p>
+    <w:p>
+      <w:r>
+        <w:t>Director-level eligibility, change-in-director notice, report attestation, and indemnification/severance board duties, folded into v2.1 from Caffrey2 §§1.7—1.11, 2.3, and 12.2. Caffrey2-sourced; verify.</w:t>
+      </w:r>
+    </w:p>
+    <w:p>
+      <w:r>
+        <w:rPr>
+          <w:b/>
+        </w:rPr>
+        <w:t>ELG-01  —  Full board / institution  ·  BHC &amp; IDI</w:t>
+      </w:r>
+    </w:p>
+    <w:p>
+      <w:r>
+        <w:t>A bank in troubled condition or not meeting minimum capital must give the agency 30 days’ written notice before adding or replacing a director or senior executive officer (the “914 process”), with CBCA/FFIEC background information; a disapproved individual may not serve while an appeal is pending.</w:t>
+      </w:r>
+    </w:p>
+    <w:p>
+      <w:r>
+        <w:t>Source: 12 U.S.C. 1831i; FRB Reg Y 12 CFR 225.71—.73; OCC 12 CFR 5.51. [URL not captured]</w:t>
+      </w:r>
+    </w:p>
+    <w:p>
+      <w:r>
+        <w:rPr>
+          <w:i/>
+        </w:rPr>
+        <w:t>Legal force: Statute / Regulation  ·  Consequence: Enforcement; disapproval bars service  ·  Cadence: Event-driven  ·  Cluster: Director eligibility &amp; continuity  ·  Redundancy: Candidate redundancy (parallel FRB/OCC processes)  ·  Confidence: Medium (Caffrey2-sourced; verify against primary source)</w:t>
+      </w:r>
+    </w:p>
+    <w:p>
+      <w:r>
+        <w:rPr>
+          <w:i/>
+        </w:rPr>
+        <w:t>Overlap: Parallel FRB and OCC change-in-director notice regimes.  Reform: Single interagency change-in-director notice procedure.</w:t>
+      </w:r>
+    </w:p>
+    <w:p>
+      <w:r>
+        <w:rPr>
+          <w:b/>
+        </w:rPr>
+        <w:t>ELG-02  —  Each director  ·  BHC &amp; IDI</w:t>
+      </w:r>
+    </w:p>
+    <w:p>
+      <w:r>
+        <w:t>Statutory disqualification: a person convicted of (or in pretrial diversion for) a crime involving dishonesty, breach of trust, or money laundering is barred from serving as an institution-affiliated party absent agency consent; a removal/prohibition order terminates the directorship on service.</w:t>
+      </w:r>
+    </w:p>
+    <w:p>
+      <w:r>
+        <w:t>Source: 12 U.S.C. 1829; FDI Act §8(e), §8(g). [URL not captured]</w:t>
+      </w:r>
+    </w:p>
+    <w:p>
+      <w:r>
+        <w:rPr>
+          <w:i/>
+        </w:rPr>
+        <w:t>Legal force: Statute  ·  Consequence: Automatic bar; criminal/CMP exposure  ·  Cadence: Event-driven  ·  Cluster: Director eligibility &amp; continuity  ·  Redundancy: Unique / limited overlap  ·  Confidence: Medium (Caffrey2-sourced; verify against primary source)</w:t>
+      </w:r>
+    </w:p>
+    <w:p>
+      <w:r>
+        <w:rPr>
+          <w:i/>
+        </w:rPr>
+        <w:t>Overlap: Director-level eligibility bar.  Reform: Retain; statutory.</w:t>
+      </w:r>
+    </w:p>
+    <w:p>
+      <w:r>
+        <w:rPr>
+          <w:b/>
+        </w:rPr>
+        <w:t>ELG-03  —  Designated directors  ·  IDI</w:t>
+      </w:r>
+    </w:p>
+    <w:p>
+      <w:r>
+        <w:t>The correctness of each Call Report (report of condition) must be attested by at least two directors (three for a national bank) other than the declaring officer; directors review and sign the report of examination; a change of CEO or director is reported promptly on a change in control.</w:t>
+      </w:r>
+    </w:p>
+    <w:p>
+      <w:r>
+        <w:t>Source: FDI Act §7(a)(3); FDI Act §7(j); OCC Comptroller’s Licensing Manual. [URL not captured]</w:t>
+      </w:r>
+    </w:p>
+    <w:p>
+      <w:r>
+        <w:rPr>
+          <w:i/>
+        </w:rPr>
+        <w:t>Legal force: Statute / Regulation  ·  Consequence: Enforcement; false-entry exposure  ·  Cadence: Quarterly / event-driven  ·  Cluster: Director eligibility &amp; continuity  ·  Redundancy: Unique / limited overlap  ·  Confidence: Medium (Caffrey2-sourced; verify against primary source)</w:t>
+      </w:r>
+    </w:p>
+    <w:p>
+      <w:r>
+        <w:rPr>
+          <w:i/>
+        </w:rPr>
+        <w:t>Overlap: Recurring attestation duty; low marginal burden.  Reform: Retain.</w:t>
+      </w:r>
+    </w:p>
+    <w:p>
+      <w:r>
+        <w:rPr>
+          <w:b/>
+        </w:rPr>
+        <w:t>ELG-04  —  Full board  ·  BHC &amp; IDI</w:t>
+      </w:r>
+    </w:p>
+    <w:p>
+      <w:r>
+        <w:t>Board determinations governing indemnification of institution-affiliated parties (good-faith / best-interests / no-material-adverse-safety-and-soundness findings, with interested-party recusal) and golden-parachute and severance payments under the Part 359 prohibitions and permitted-payment exceptions.</w:t>
+      </w:r>
+    </w:p>
+    <w:p>
+      <w:r>
+        <w:t>Source: 12 CFR part 359 (FDIC); FDI Act §18(k). [URL not captured]</w:t>
+      </w:r>
+    </w:p>
+    <w:p>
+      <w:r>
+        <w:rPr>
+          <w:i/>
+        </w:rPr>
+        <w:t>Legal force: Regulation  ·  Consequence: Enforcement; prohibited-payment liability  ·  Cadence: Event-driven  ·  Cluster: Compensation &amp; indemnification governance  ·  Redundancy: Limited overlap (distinct DIF protection)  ·  Confidence: Medium (Caffrey2-sourced; verify against primary source)</w:t>
+      </w:r>
+    </w:p>
+    <w:p>
+      <w:r>
+        <w:rPr>
+          <w:i/>
+        </w:rPr>
+        <w:t>Overlap: Distinct from incentive-compensation governance; protects the insured bank and the Deposit Insurance Fund.  Reform: Retain; coordinate with a finalized §956 framework if adopted.</w:t>
       </w:r>
     </w:p>
     <w:p>
@@ -14678,7 +15169,7 @@
           <w:sz w:val="22"/>
           <w:szCs w:val="22"/>
         </w:rPr>
-        <w:t xml:space="preserve">The 149 supervisory expectations placed on GSIB boards by SR/CA letters, OCC bulletins and handbooks, FDIC and FFIEC manuals, the CFPB manual, and interagency guidance. These shape examinations and ratings but are not, by themselves, legally binding — see each entry's supervisory-consequence rating.</w:t>
+        <w:t>The 153 supervisory expectations placed on GSIB boards by SR/CA letters, OCC bulletins and handbooks, FDIC and FFIEC manuals, the CFPB manual, and interagency guidance (v2.0: 149; v2.1 adds credit-risk oversight and additional consumer-compliance expectations). These shape examinations and ratings but are not, by themselves, legally binding — see each entry’s supervisory-consequence rating.</w:t>
       </w:r>
     </w:p>
     <w:p>
@@ -34503,6 +34994,168 @@
     </w:p>
     <w:p>
       <w:pPr>
+        <w:pStyle w:val="Heading2"/>
+      </w:pPr>
+      <w:r>
+        <w:t>14. Credit risk oversight (supervisory)</w:t>
+      </w:r>
+    </w:p>
+    <w:p>
+      <w:r>
+        <w:t>The supervisory-expectation layer for credit risk, paralleling the binding credit-risk duties added in Part I. Caffrey2-sourced; verify.</w:t>
+      </w:r>
+    </w:p>
+    <w:p>
+      <w:r>
+        <w:rPr>
+          <w:b/>
+        </w:rPr>
+        <w:t>CRX-01  —  Full board or risk/credit committee  ·  BHC &amp; IDI</w:t>
+      </w:r>
+    </w:p>
+    <w:p>
+      <w:r>
+        <w:t>Board oversight of credit-risk appetite, concentration limits, and credit-administration quality; review of problem-asset and ACL trends through periodic MIS.</w:t>
+      </w:r>
+    </w:p>
+    <w:p>
+      <w:r>
+        <w:t>Source: OCC Comptroller’s Handbook (Concentrations of Credit; Allowances); Federal Reserve Commercial Bank Examination Manual; credit-risk SR letters. [URL not captured]</w:t>
+      </w:r>
+    </w:p>
+    <w:p>
+      <w:r>
+        <w:rPr>
+          <w:i/>
+        </w:rPr>
+        <w:t>Legal force: Supervisory guidance  ·  Consequence: Exam findings / MRAs; informs ratings (no direct legal force)  ·  Cadence: Periodic  ·  Cluster: Credit risk governance  ·  Redundancy: Candidate redundancy  ·  Confidence: Medium (Caffrey2-sourced; verify against primary source)</w:t>
+      </w:r>
+    </w:p>
+    <w:p>
+      <w:r>
+        <w:rPr>
+          <w:i/>
+        </w:rPr>
+        <w:t>Overlap: Elaborates the binding real-estate-lending and ACL duties.  Reform: Cross-reference the handbook to the rule; avoid restating.</w:t>
+      </w:r>
+    </w:p>
+    <w:p>
+      <w:r>
+        <w:rPr>
+          <w:b/>
+        </w:rPr>
+        <w:t>CRX-02  —  Risk / credit committee  ·  BHC &amp; IDI</w:t>
+      </w:r>
+    </w:p>
+    <w:p>
+      <w:r>
+        <w:t>Board or committee oversight of counterparty credit risk and, where applicable, leveraged-lending risk-appetite and exception reporting.</w:t>
+      </w:r>
+    </w:p>
+    <w:p>
+      <w:r>
+        <w:t>Source: SR 11-10 / interagency counterparty guidance; 2013 Interagency Leveraged Lending Guidance (supervisory; enforcement-deprioritized). [URL not captured]</w:t>
+      </w:r>
+    </w:p>
+    <w:p>
+      <w:r>
+        <w:rPr>
+          <w:i/>
+        </w:rPr>
+        <w:t>Legal force: Supervisory guidance  ·  Consequence: Exam findings / MRAs; informs ratings  ·  Cadence: Periodic  ·  Cluster: Credit risk governance  ·  Redundancy: Candidate redundancy  ·  Confidence: Medium (Caffrey2-sourced; verify against primary source)</w:t>
+      </w:r>
+    </w:p>
+    <w:p>
+      <w:r>
+        <w:rPr>
+          <w:i/>
+        </w:rPr>
+        <w:t>Overlap: Overlaps enterprise risk-limit monitoring.  Reform: Fold into risk-committee limit oversight.</w:t>
+      </w:r>
+    </w:p>
+    <w:p>
+      <w:pPr>
+        <w:pStyle w:val="Heading2"/>
+      </w:pPr>
+      <w:r>
+        <w:t>15. Additional consumer &amp; compliance oversight</w:t>
+      </w:r>
+    </w:p>
+    <w:p>
+      <w:r>
+        <w:t>Consumer- and conduct-compliance board-oversight items beyond the core CMS cluster. Caffrey2-sourced; verify.</w:t>
+      </w:r>
+    </w:p>
+    <w:p>
+      <w:r>
+        <w:rPr>
+          <w:b/>
+        </w:rPr>
+        <w:t>CCX-01  —  Full board  ·  BHC &amp; IDI</w:t>
+      </w:r>
+    </w:p>
+    <w:p>
+      <w:r>
+        <w:t>Board oversight that strategic plans consider community credit needs and CRA performance.</w:t>
+      </w:r>
+    </w:p>
+    <w:p>
+      <w:r>
+        <w:t>Source: Community Reinvestment Act, 12 U.S.C. 2901 et seq.; OCC Director’s Reference Guide. [URL not captured]</w:t>
+      </w:r>
+    </w:p>
+    <w:p>
+      <w:r>
+        <w:rPr>
+          <w:i/>
+        </w:rPr>
+        <w:t>Legal force: Statute / supervisory guidance  ·  Consequence: Exam findings; CRA rating  ·  Cadence: Periodic  ·  Cluster: Consumer compliance (CMS)  ·  Redundancy: Candidate redundancy  ·  Confidence: Medium (Caffrey2-sourced; verify against primary source)</w:t>
+      </w:r>
+    </w:p>
+    <w:p>
+      <w:r>
+        <w:rPr>
+          <w:i/>
+        </w:rPr>
+        <w:t>Overlap: Distinct consumer mandate.  Reform: Coordinate within the CMS oversight cycle.</w:t>
+      </w:r>
+    </w:p>
+    <w:p>
+      <w:r>
+        <w:rPr>
+          <w:b/>
+        </w:rPr>
+        <w:t>CCX-02  —  Full board or committee  ·  IDI</w:t>
+      </w:r>
+    </w:p>
+    <w:p>
+      <w:r>
+        <w:t>Board oversight of compliance with the FDIC deposit-insurance representation/advertising rules (Part 328) and, for FX-active firms, oversight of the foreign-exchange-settlement compliance function.</w:t>
+      </w:r>
+    </w:p>
+    <w:p>
+      <w:r>
+        <w:t>Source: 12 CFR part 328; SR 13-24. [URL not captured]</w:t>
+      </w:r>
+    </w:p>
+    <w:p>
+      <w:r>
+        <w:rPr>
+          <w:i/>
+        </w:rPr>
+        <w:t>Legal force: Regulation / supervisory guidance  ·  Consequence: Exam findings / MRAs  ·  Cadence: Periodic  ·  Cluster: Consumer compliance (CMS)  ·  Redundancy: Unique / limited overlap  ·  Confidence: Medium (Caffrey2-sourced; verify against primary source)</w:t>
+      </w:r>
+    </w:p>
+    <w:p>
+      <w:r>
+        <w:rPr>
+          <w:i/>
+        </w:rPr>
+        <w:t>Overlap: Discrete conduct items.  Reform: Coordinate within the CMS oversight cycle.</w:t>
+      </w:r>
+    </w:p>
+    <w:p>
+      <w:pPr>
         <w:pStyle w:val="Heading1"/>
       </w:pPr>
       <w:r>
@@ -38756,7 +39409,7 @@
           <w:sz w:val="19"/>
           <w:szCs w:val="19"/>
         </w:rPr>
-        <w:t xml:space="preserve">Minimum reform lever: One enterprise framework approval with an IDI addendum.</w:t>
+        <w:t>Minimum reform lever: One enterprise framework approval with an IDI addendum. Note (v2.1): this expands the existing OCC Appendix D reliance accommodation — under which a covered bank may use the parent’s framework in its entirety where the framework meets the minimum standards and the parent and bank risk profiles are substantially the same — a partial mitigant already in law rather than a novel device.</w:t>
       </w:r>
     </w:p>
     <w:p>
@@ -39040,7 +39693,7 @@
           <w:sz w:val="19"/>
           <w:szCs w:val="19"/>
         </w:rPr>
-        <w:t xml:space="preserve">Sources: 31 CFR 1010.210; agency program rules; FFIEC manual; FinCEN reproposal</w:t>
+        <w:t>Sources: 31 CFR 1010.210; agency program rules (12 CFR 21.21; 12 CFR 326.8(b)(1); FRS Rule 211.5(m)); FFIEC manual; 2024 and 2026 FinCEN/agency program-approval proposals (in tension; neither in force)</w:t>
       </w:r>
     </w:p>
     <w:p>
@@ -39080,7 +39733,7 @@
           <w:sz w:val="19"/>
           <w:szCs w:val="19"/>
         </w:rPr>
-        <w:t xml:space="preserve">Minimum reform lever: Cross-reference manual to the rule; avoid restating.</w:t>
+        <w:t>Minimum reform lever: Cross-reference the FFIEC manual to the rule; avoid restating. Resolve the two unreconciled pending rewrites (the 2024 proposals would add a freestanding board-oversight standard and annual ratification; the 2026 proposals would permit approval by the board, an equivalent body, or senior management) before they compound the layering.</w:t>
       </w:r>
     </w:p>
     <w:p>
@@ -39404,7 +40057,7 @@
           <w:sz w:val="19"/>
           <w:szCs w:val="19"/>
         </w:rPr>
-        <w:t xml:space="preserve">Minimum reform lever: One enterprise info-security program approval; joint SEC/banking statement on cyber oversight.</w:t>
+        <w:t>Minimum reform lever: One enterprise info-security program approval; joint SEC/banking statement on cyber oversight. Note (v2.1): the 36-hour interagency computer-security incident-notification rule and the SEC cyber-disclosure regime impose non-aligned timelines and triggers on the same incident; harmonization here is selection of a single operational standard, not deletion.</w:t>
       </w:r>
     </w:p>
     <w:p>
@@ -40336,7 +40989,7 @@
           <w:sz w:val="19"/>
           <w:szCs w:val="19"/>
         </w:rPr>
-        <w:t xml:space="preserve">Sources: SR 26-2 (replaced SR 11-7); OCC App. D (residual)</w:t>
+        <w:t>Sources: SR 26-2 and OCC Bulletin 2026-13 (both eff. Apr. 17, 2026; superseding SR 11-7 and OCC Bulletin 2011-12); OCC App. D (residual)</w:t>
       </w:r>
     </w:p>
     <w:p>
@@ -40349,7 +41002,7 @@
           <w:sz w:val="19"/>
           <w:szCs w:val="19"/>
         </w:rPr>
-        <w:t xml:space="preserve">Duplicative: Largely removed in 2026; residual oversight via the risk-governance framework.</w:t>
+        <w:t>Duplicative: Largely removed in 2026. Critically, SR 26-2 and OCC Bulletin 2026-13 are expressly non-prescriptive and non-enforceable — the guidance states that non-compliance “will not result in” supervisory action — so neither should be cited as the source of a binding board-approval mandate; any enforceable duty in this domain derives from safety-and-soundness law (12 U.S.C. 1831p-1; 12 CFR part 30 App. D), not the guidance. Residual oversight runs through the risk-governance framework.</w:t>
       </w:r>
     </w:p>
     <w:p>
@@ -40544,6 +41197,155 @@
     <w:p>
       <w:r>
         <w:br w:type="page"/>
+      </w:r>
+    </w:p>
+    <w:p>
+      <w:pPr>
+        <w:pStyle w:val="Heading1"/>
+      </w:pPr>
+      <w:r>
+        <w:t>Personal and individual-director liability (analytically distinct)</w:t>
+      </w:r>
+    </w:p>
+    <w:p>
+      <w:r>
+        <w:t>Scope note. The items below run to the individual director rather than to the board as a governance body, and several are triggered only in enforcement, receivership, or resolution. Following the Caffrey2 memo, they are catalogued because personal-liability exposure amplifies the cumulative burden of the board duties inventoried above — but they are analytically distinct and are NOT counted in any enumeration of recurring annual board actions or in the burden model. Caffrey2-sourced; verify.</w:t>
+      </w:r>
+    </w:p>
+    <w:p>
+      <w:r>
+        <w:rPr>
+          <w:b/>
+        </w:rPr>
+        <w:t>PLB-01  —  Each director  ·  BHC &amp; IDI</w:t>
+      </w:r>
+    </w:p>
+    <w:p>
+      <w:r>
+        <w:t>Criminal liability for false entries: every director of a bank or BHC is subject to the same criminal penalties for false entries.</w:t>
+      </w:r>
+    </w:p>
+    <w:p>
+      <w:r>
+        <w:t>Source: 18 U.S.C. 1005; 12 U.S.C. 1847(a)(2). [URL not captured]</w:t>
+      </w:r>
+    </w:p>
+    <w:p>
+      <w:r>
+        <w:rPr>
+          <w:i/>
+        </w:rPr>
+        <w:t>Legal force: Statute  ·  Consequence: Criminal  ·  Cadence: Event-driven  ·  Cluster: Personal liability  ·  Redundancy: n/a (individual)  ·  Confidence: Medium (Caffrey2-sourced; verify against primary source)</w:t>
+      </w:r>
+    </w:p>
+    <w:p>
+      <w:r>
+        <w:rPr>
+          <w:i/>
+        </w:rPr>
+        <w:t>Note: Individual exposure, not a board-level governance action.</w:t>
+      </w:r>
+    </w:p>
+    <w:p>
+      <w:r>
+        <w:rPr>
+          <w:b/>
+        </w:rPr>
+        <w:t>PLB-02  —  Each director  ·  BHC &amp; IDI</w:t>
+      </w:r>
+    </w:p>
+    <w:p>
+      <w:r>
+        <w:t>Removal and prohibition: an institution-affiliated party may be removed/prohibited for misconduct, and a director with knowledge of a violation must take action to stop or prevent recurrence.</w:t>
+      </w:r>
+    </w:p>
+    <w:p>
+      <w:r>
+        <w:t>Source: FDI Act §8(e); §8(e)(2)(B). [URL not captured]</w:t>
+      </w:r>
+    </w:p>
+    <w:p>
+      <w:r>
+        <w:rPr>
+          <w:i/>
+        </w:rPr>
+        <w:t>Legal force: Statute  ·  Consequence: Removal/prohibition; CMP  ·  Cadence: Event-driven  ·  Cluster: Personal liability  ·  Redundancy: n/a (individual)  ·  Confidence: Medium (Caffrey2-sourced; verify against primary source)</w:t>
+      </w:r>
+    </w:p>
+    <w:p>
+      <w:r>
+        <w:rPr>
+          <w:i/>
+        </w:rPr>
+        <w:t>Note: Individual exposure; bears on the risk calculus of board service.</w:t>
+      </w:r>
+    </w:p>
+    <w:p>
+      <w:r>
+        <w:rPr>
+          <w:b/>
+        </w:rPr>
+        <w:t>PLB-03  —  Each director  ·  BHC &amp; IDI</w:t>
+      </w:r>
+    </w:p>
+    <w:p>
+      <w:r>
+        <w:t>Receivership / orderly-liquidation liability: personal liability for gross negligence in FDIC-as-receiver actions, and §210(s) compensation recoupment from directors “substantially responsible” for the failure under a negligence standard, with the burden on the director.</w:t>
+      </w:r>
+    </w:p>
+    <w:p>
+      <w:r>
+        <w:t>Source: 12 U.S.C. 1821(k); 12 U.S.C. 5390(f); 12 U.S.C. 5390(s); 12 CFR 380.7. [URL not captured]</w:t>
+      </w:r>
+    </w:p>
+    <w:p>
+      <w:r>
+        <w:rPr>
+          <w:i/>
+        </w:rPr>
+        <w:t>Legal force: Statute  ·  Consequence: Monetary damages; comp recoupment  ·  Cadence: Event-driven (resolution)  ·  Cluster: Personal liability  ·  Redundancy: n/a (individual)  ·  Confidence: Medium (Caffrey2-sourced; verify against primary source)</w:t>
+      </w:r>
+    </w:p>
+    <w:p>
+      <w:r>
+        <w:rPr>
+          <w:i/>
+        </w:rPr>
+        <w:t>Note: Two culpability standards apply — gross negligence for damages, simple negligence for recoupment.</w:t>
+      </w:r>
+    </w:p>
+    <w:p>
+      <w:r>
+        <w:rPr>
+          <w:b/>
+        </w:rPr>
+        <w:t>PLB-04  —  Full board / each director  ·  BHC &amp; IDI</w:t>
+      </w:r>
+    </w:p>
+    <w:p>
+      <w:r>
+        <w:t>Indemnification limits, D&amp;O insurance, and fidelity bonds: Part 359 prohibits indemnifying culpable IAPs; the board bears a cost-benefit duty on D&amp;O coverage and on maintaining adequate fidelity bonds.</w:t>
+      </w:r>
+    </w:p>
+    <w:p>
+      <w:r>
+        <w:t>Source: 12 CFR part 359; 12 U.S.C. 1818(n); OCC Director’s Book (D&amp;O / fidelity-bond expectations). [URL not captured]</w:t>
+      </w:r>
+    </w:p>
+    <w:p>
+      <w:r>
+        <w:rPr>
+          <w:i/>
+        </w:rPr>
+        <w:t>Legal force: Regulation / supervisory expectation  ·  Consequence: Prohibited-payment liability; personal loss exposure  ·  Cadence: Periodic / event-driven  ·  Cluster: Personal liability  ·  Redundancy: n/a (individual)  ·  Confidence: Medium (Caffrey2-sourced; verify against primary source)</w:t>
+      </w:r>
+    </w:p>
+    <w:p>
+      <w:r>
+        <w:rPr>
+          <w:i/>
+        </w:rPr>
+        <w:t>Cross-cutting: a single prudence objective is enforced through three federal mechanisms with two culpability standards; the chief internal tension is between 12 U.S.C. 1818(n) fee-shifting and Part 359’s prohibition on indemnifying culpable parties.</w:t>
       </w:r>
     </w:p>
     <w:p>
@@ -44602,7 +45404,7 @@
           <w:sz w:val="19"/>
           <w:szCs w:val="19"/>
         </w:rPr>
-        <w:t xml:space="preserve">Incremental note: Counting only rows flagged 'Yes' (genuinely additional to normal board work) gives a much smaller incremental figure; most board hours would exist under any sound governance regime. The reform-relevant number is the duplication-driven increment, not the gross total.</w:t>
+        <w:t>Incremental note: Counting only rows flagged 'Yes' (genuinely additional to normal board work) gives a much smaller incremental figure; most board hours would exist under any sound governance regime. The reform-relevant number is the duplication-driven increment, not the gross total. The resolution-planning cluster is annualized on the biennial Title I cadence (12 CFR 243.4(a)); treating it as annual would overstate that cluster’s hours.</w:t>
       </w:r>
     </w:p>
     <w:p>
@@ -46489,6 +47291,41 @@
       </w:r>
     </w:p>
     <w:p>
+      <w:r>
+        <w:t>Design principle — harmonization is selection, not deletion. Where the same objective is pursued through divergent standards (most acutely the audit-committee independence/expertise tests and the divergent cyber-incident notification timelines), consolidation does not mean removing a requirement; it means choosing which agency’s formulation prevails. Each reform below preserves the strictest substantive standard and removes only the parallel documentation and examination footprint.</w:t>
+      </w:r>
+    </w:p>
+    <w:p>
+      <w:r>
+        <w:t>Feasibility tiers (lowest cost first). The specific reforms below map onto five tiers ordered by legal instrument and difficulty:</w:t>
+      </w:r>
+    </w:p>
+    <w:p>
+      <w:r>
+        <w:t>Tier 1 — Guidance consolidation (agency-curable, lowest cost): collapse parallel SR-letter / bulletin / interagency-statement expectations into single interagency guidance, on the model of the 2023 Interagency Third-Party Risk Management Guidance (candidates: risk-appetite, incentive-compensation, internal-audit, and credit-risk guidance).</w:t>
+      </w:r>
+    </w:p>
+    <w:p>
+      <w:r>
+        <w:t>Tier 2 — Guidance retirement: continue the rescind-and-supersede discipline exemplified by the OCC recovery-planning rescission (eff. May 1, 2026).</w:t>
+      </w:r>
+    </w:p>
+    <w:p>
+      <w:r>
+        <w:t>Tier 3 — Rule-layer harmonization: conform divergent regulatory text (audit-committee independence; the 36-hour vs. SEC cyber-disclosure timelines) to a single prevailing formulation.</w:t>
+      </w:r>
+    </w:p>
+    <w:p>
+      <w:r>
+        <w:t>Tier 4 — Vertical (HC/IDI) rationalization: expand the OCC Appendix D reliance accommodation so a bank-subsidiary board may discharge its duty by documented reliance on the consolidated holding-company board’s action where risk profiles are substantially the same — the single highest-yield structural lever, since vertical duplication is the most pervasive overlap.</w:t>
+      </w:r>
+    </w:p>
+    <w:p>
+      <w:r>
+        <w:t>Tier 5 — Statutory consolidation (legislation): address overlaps anchored in Dodd-Frank §165, the BSA, FDI Act §36 / Part 363, and the SEC compensation-governance listing standards.</w:t>
+      </w:r>
+    </w:p>
+    <w:p>
       <w:pPr>
         <w:keepNext/>
         <w:spacing w:after="8" w:before="104"/>
@@ -48323,7 +49160,7 @@
         <w:sz w:val="16"/>
         <w:szCs w:val="16"/>
       </w:rPr>
-      <w:t xml:space="preserve">Board Duties at Category I U.S. GSIBs — Two-Layer Inventory v2.0 — as of June 5, 2026  |  Page </w:t>
+      <w:t xml:space="preserve">Board Duties at Category I U.S. GSIBs — Two-Layer Inventory v2.1 — as of June 24, 2026  |  Page </w:t>
     </w:r>
     <w:r>
       <w:rPr>
@@ -48354,7 +49191,7 @@
         <w:sz w:val="16"/>
         <w:szCs w:val="16"/>
       </w:rPr>
-      <w:t xml:space="preserve">Board Duties at Category I U.S. GSIBs — Two-Layer Inventory v2.0 — as of June 5, 2026  |  Page </w:t>
+      <w:t xml:space="preserve">Board Duties at Category I U.S. GSIBs — Two-Layer Inventory v2.1 — as of June 24, 2026  |  Page </w:t>
     </w:r>
     <w:r>
       <w:rPr>
@@ -48385,7 +49222,7 @@
         <w:sz w:val="16"/>
         <w:szCs w:val="16"/>
       </w:rPr>
-      <w:t xml:space="preserve">Board Duties at Category I U.S. GSIBs — Two-Layer Inventory v2.0 — as of June 5, 2026  |  Page </w:t>
+      <w:t xml:space="preserve">Board Duties at Category I U.S. GSIBs — Two-Layer Inventory v2.1 — as of June 24, 2026  |  Page </w:t>
     </w:r>
     <w:r>
       <w:rPr>
@@ -48416,7 +49253,7 @@
         <w:sz w:val="16"/>
         <w:szCs w:val="16"/>
       </w:rPr>
-      <w:t xml:space="preserve">Board Duties at Category I U.S. GSIBs — Two-Layer Inventory v2.0 — as of June 5, 2026  |  Page </w:t>
+      <w:t xml:space="preserve">Board Duties at Category I U.S. GSIBs — Two-Layer Inventory v2.1 — as of June 24, 2026  |  Page </w:t>
     </w:r>
     <w:r>
       <w:rPr>
@@ -48447,7 +49284,7 @@
         <w:sz w:val="16"/>
         <w:szCs w:val="16"/>
       </w:rPr>
-      <w:t xml:space="preserve">Board Duties at Category I U.S. GSIBs — Two-Layer Inventory v2.0 — as of June 5, 2026  |  Page </w:t>
+      <w:t xml:space="preserve">Board Duties at Category I U.S. GSIBs — Two-Layer Inventory v2.1 — as of June 24, 2026  |  Page </w:t>
     </w:r>
     <w:r>
       <w:rPr>

</xml_diff>